<commit_message>
fix: make allowed-methods penalty discretionary in code rubric
Removes the fixed 5-point deduction language from code-rubric.docx's
allowed-methods note and Before You Submit checklist. Any point reduction
for using a disallowed import or method is now left to the grader's
discretion, matching the corresponding change already made to the local
code-rubric.md and RUBRICS.md sources.

Co-Authored-By: Claude Sonnet 5 <noreply@anthropic.com>
</commit_message>
<xml_diff>
--- a/code-rubric.docx
+++ b/code-rubric.docx
@@ -2059,14 +2059,13 @@
           <w:color w:val="1A1A1A"/>
           <w:sz w:val="19"/>
         </w:rPr>
-        <w:t>Every assignment lists the imports and methods available to you, carried forward from Unit 1. Using something outside that list costs</w:t>
+        <w:t>Every assignment lists the imports and methods available to you, carried forward from Unit 1. Using something outside that list may cost points off the assignment total, at your grader's discretion — the work is scored on its own terms first, and any such reduction comes off after.</w:t>
       </w:r>
       <w:r>
         <w:rPr>
           <w:color w:val="1A1A1A"/>
           <w:sz w:val="19"/>
         </w:rPr>
-        <w:t xml:space="preserve"> </w:t>
       </w:r>
       <w:proofErr w:type="gramStart"/>
       <w:r>
@@ -2074,7 +2073,6 @@
           <w:color w:val="1A1A1A"/>
           <w:sz w:val="19"/>
         </w:rPr>
-        <w:t>points</w:t>
       </w:r>
       <w:proofErr w:type="gramEnd"/>
       <w:r>
@@ -2082,21 +2080,18 @@
           <w:color w:val="1A1A1A"/>
           <w:sz w:val="19"/>
         </w:rPr>
-        <w:t xml:space="preserve"> off the assignment total. It is charged once however many appear, against the assignment total rather than any one exercise or dimension — the work is scored on its own terms first, then the</w:t>
       </w:r>
       <w:r>
         <w:rPr>
           <w:color w:val="1A1A1A"/>
           <w:sz w:val="19"/>
         </w:rPr>
-        <w:t xml:space="preserve"> </w:t>
       </w:r>
       <w:r>
         <w:rPr>
           <w:color w:val="1A1A1A"/>
           <w:sz w:val="19"/>
         </w:rPr>
-        <w:t>points come off.</w:t>
       </w:r>
     </w:p>
     <w:p>
@@ -2471,7 +2466,7 @@
           <w:color w:val="1A1A1A"/>
           <w:sz w:val="19"/>
         </w:rPr>
-        <w:t>for anything you used that is not on it. Finding one now costs nothing. Leaving it costs points off the assignment total.</w:t>
+        <w:t>for anything you used that is not on it. Finding one now costs nothing. Leaving it may cost points off the assignment total, at your grader's discretion.</w:t>
       </w:r>
     </w:p>
     <w:sectPr>

</xml_diff>